<commit_message>
Update DevOps unit assignment documents
Co-authored-by: Copilot <223556219+Copilot@users.noreply.github.com>
</commit_message>
<xml_diff>
--- a/Yash_1112_Unit2_devops.docx
+++ b/Yash_1112_Unit2_devops.docx
@@ -195,8 +195,13 @@
           </w:tcPr>
           <w:p>
             <w:r>
-              <w:t>Pratik Sakhare</w:t>
-            </w:r>
+              <w:t xml:space="preserve">Yash </w:t>
+            </w:r>
+            <w:proofErr w:type="spellStart"/>
+            <w:r>
+              <w:t>Bhor</w:t>
+            </w:r>
+            <w:proofErr w:type="spellEnd"/>
           </w:p>
         </w:tc>
       </w:tr>

</xml_diff>